<commit_message>
Versión final del informe
- Se actualiza el word y PDF del informe a su versión final.
</commit_message>
<xml_diff>
--- a/Documentación/Informe_PPS_StudIA.docx
+++ b/Documentación/Informe_PPS_StudIA.docx
@@ -1130,18 +1130,6 @@
       <w:pPr>
         <w:pStyle w:val="Textoindependiente"/>
         <w:spacing w:before="184" w:line="276" w:lineRule="auto"/>
-        <w:ind w:left="720" w:right="30"/>
-        <w:rPr>
-          <w:rFonts w:cs="Arial"/>
-          <w:spacing w:val="-2"/>
-          <w:w w:val="105"/>
-        </w:rPr>
-      </w:pPr>
-    </w:p>
-    <w:p>
-      <w:pPr>
-        <w:pStyle w:val="Textoindependiente"/>
-        <w:spacing w:before="184" w:line="276" w:lineRule="auto"/>
         <w:ind w:left="0" w:right="30"/>
         <w:rPr>
           <w:noProof/>
@@ -1157,6 +1145,52 @@
           <w:docGrid w:linePitch="299"/>
         </w:sectPr>
       </w:pPr>
+    </w:p>
+    <w:p>
+      <w:pPr>
+        <w:pStyle w:val="Ttulo1"/>
+      </w:pPr>
+      <w:bookmarkStart w:id="1" w:name="_Toc240290476"/>
+      <w:r>
+        <w:lastRenderedPageBreak/>
+        <w:t>Reservado a la facultad para la evaluación</w:t>
+      </w:r>
+      <w:bookmarkEnd w:id="1"/>
+    </w:p>
+    <w:p>
+      <w:pPr>
+        <w:spacing w:line="276" w:lineRule="auto"/>
+        <w:rPr>
+          <w:rFonts w:cs="Arial"/>
+        </w:rPr>
+      </w:pPr>
+    </w:p>
+    <w:p>
+      <w:pPr>
+        <w:rPr>
+          <w:rFonts w:cs="Arial"/>
+        </w:rPr>
+      </w:pPr>
+      <w:r>
+        <w:rPr>
+          <w:rFonts w:cs="Arial"/>
+        </w:rPr>
+        <w:br w:type="page"/>
+      </w:r>
+    </w:p>
+    <w:p>
+      <w:pPr>
+        <w:rPr>
+          <w:rFonts w:cs="Arial"/>
+        </w:rPr>
+      </w:pPr>
+      <w:r>
+        <w:rPr>
+          <w:rFonts w:cs="Arial"/>
+        </w:rPr>
+        <w:lastRenderedPageBreak/>
+        <w:br w:type="page"/>
+      </w:r>
     </w:p>
     <w:sdt>
       <w:sdtPr>
@@ -1231,13 +1265,13 @@
             </w:rPr>
             <w:fldChar w:fldCharType="separate"/>
           </w:r>
-          <w:hyperlink w:anchor="_Toc240061693" w:history="1">
+          <w:hyperlink w:anchor="_Toc240290476" w:history="1">
             <w:r>
               <w:rPr>
                 <w:rStyle w:val="Hipervnculo"/>
                 <w:noProof/>
               </w:rPr>
-              <w:t>Introducción</w:t>
+              <w:t>Reservado a la facultad para la evaluación</w:t>
             </w:r>
             <w:r>
               <w:rPr>
@@ -1258,7 +1292,7 @@
                 <w:noProof/>
                 <w:webHidden/>
               </w:rPr>
-              <w:instrText xml:space="preserve"> PAGEREF _Toc240061693 \h </w:instrText>
+              <w:instrText xml:space="preserve"> PAGEREF _Toc240290476 \h </w:instrText>
             </w:r>
             <w:r>
               <w:rPr>
@@ -1278,7 +1312,7 @@
                 <w:noProof/>
                 <w:webHidden/>
               </w:rPr>
-              <w:t>2</w:t>
+              <w:t>1</w:t>
             </w:r>
             <w:r>
               <w:rPr>
@@ -1305,12 +1339,86 @@
               <w14:ligatures w14:val="standardContextual"/>
             </w:rPr>
           </w:pPr>
-          <w:hyperlink w:anchor="_Toc240061694" w:history="1">
+          <w:hyperlink w:anchor="_Toc240290477" w:history="1">
             <w:r>
               <w:rPr>
                 <w:rStyle w:val="Hipervnculo"/>
                 <w:noProof/>
               </w:rPr>
+              <w:t>Introducción</w:t>
+            </w:r>
+            <w:r>
+              <w:rPr>
+                <w:noProof/>
+                <w:webHidden/>
+              </w:rPr>
+              <w:tab/>
+            </w:r>
+            <w:r>
+              <w:rPr>
+                <w:noProof/>
+                <w:webHidden/>
+              </w:rPr>
+              <w:fldChar w:fldCharType="begin"/>
+            </w:r>
+            <w:r>
+              <w:rPr>
+                <w:noProof/>
+                <w:webHidden/>
+              </w:rPr>
+              <w:instrText xml:space="preserve"> PAGEREF _Toc240290477 \h </w:instrText>
+            </w:r>
+            <w:r>
+              <w:rPr>
+                <w:noProof/>
+                <w:webHidden/>
+              </w:rPr>
+            </w:r>
+            <w:r>
+              <w:rPr>
+                <w:noProof/>
+                <w:webHidden/>
+              </w:rPr>
+              <w:fldChar w:fldCharType="separate"/>
+            </w:r>
+            <w:r>
+              <w:rPr>
+                <w:noProof/>
+                <w:webHidden/>
+              </w:rPr>
+              <w:t>4</w:t>
+            </w:r>
+            <w:r>
+              <w:rPr>
+                <w:noProof/>
+                <w:webHidden/>
+              </w:rPr>
+              <w:fldChar w:fldCharType="end"/>
+            </w:r>
+          </w:hyperlink>
+        </w:p>
+        <w:p>
+          <w:pPr>
+            <w:pStyle w:val="TDC1"/>
+            <w:tabs>
+              <w:tab w:val="right" w:leader="dot" w:pos="8498"/>
+            </w:tabs>
+            <w:rPr>
+              <w:rFonts w:asciiTheme="minorHAnsi" w:eastAsiaTheme="minorEastAsia" w:hAnsiTheme="minorHAnsi" w:cstheme="minorBidi"/>
+              <w:noProof/>
+              <w:kern w:val="2"/>
+              <w:sz w:val="24"/>
+              <w:szCs w:val="24"/>
+              <w:lang w:val="es-AR" w:eastAsia="es-AR"/>
+              <w14:ligatures w14:val="standardContextual"/>
+            </w:rPr>
+          </w:pPr>
+          <w:hyperlink w:anchor="_Toc240290478" w:history="1">
+            <w:r>
+              <w:rPr>
+                <w:rStyle w:val="Hipervnculo"/>
+                <w:noProof/>
+              </w:rPr>
               <w:t>Objetivo</w:t>
             </w:r>
             <w:r>
@@ -1332,7 +1440,7 @@
                 <w:noProof/>
                 <w:webHidden/>
               </w:rPr>
-              <w:instrText xml:space="preserve"> PAGEREF _Toc240061694 \h </w:instrText>
+              <w:instrText xml:space="preserve"> PAGEREF _Toc240290478 \h </w:instrText>
             </w:r>
             <w:r>
               <w:rPr>
@@ -1352,7 +1460,7 @@
                 <w:noProof/>
                 <w:webHidden/>
               </w:rPr>
-              <w:t>2</w:t>
+              <w:t>4</w:t>
             </w:r>
             <w:r>
               <w:rPr>
@@ -1379,7 +1487,7 @@
               <w14:ligatures w14:val="standardContextual"/>
             </w:rPr>
           </w:pPr>
-          <w:hyperlink w:anchor="_Toc240061695" w:history="1">
+          <w:hyperlink w:anchor="_Toc240290479" w:history="1">
             <w:r>
               <w:rPr>
                 <w:rStyle w:val="Hipervnculo"/>
@@ -1406,7 +1514,7 @@
                 <w:noProof/>
                 <w:webHidden/>
               </w:rPr>
-              <w:instrText xml:space="preserve"> PAGEREF _Toc240061695 \h </w:instrText>
+              <w:instrText xml:space="preserve"> PAGEREF _Toc240290479 \h </w:instrText>
             </w:r>
             <w:r>
               <w:rPr>
@@ -1426,7 +1534,7 @@
                 <w:noProof/>
                 <w:webHidden/>
               </w:rPr>
-              <w:t>2</w:t>
+              <w:t>4</w:t>
             </w:r>
             <w:r>
               <w:rPr>
@@ -1453,7 +1561,7 @@
               <w14:ligatures w14:val="standardContextual"/>
             </w:rPr>
           </w:pPr>
-          <w:hyperlink w:anchor="_Toc240061696" w:history="1">
+          <w:hyperlink w:anchor="_Toc240290480" w:history="1">
             <w:r>
               <w:rPr>
                 <w:rStyle w:val="Hipervnculo"/>
@@ -1480,7 +1588,7 @@
                 <w:noProof/>
                 <w:webHidden/>
               </w:rPr>
-              <w:instrText xml:space="preserve"> PAGEREF _Toc240061696 \h </w:instrText>
+              <w:instrText xml:space="preserve"> PAGEREF _Toc240290480 \h </w:instrText>
             </w:r>
             <w:r>
               <w:rPr>
@@ -1500,7 +1608,7 @@
                 <w:noProof/>
                 <w:webHidden/>
               </w:rPr>
-              <w:t>2</w:t>
+              <w:t>4</w:t>
             </w:r>
             <w:r>
               <w:rPr>
@@ -1527,7 +1635,7 @@
               <w14:ligatures w14:val="standardContextual"/>
             </w:rPr>
           </w:pPr>
-          <w:hyperlink w:anchor="_Toc240061697" w:history="1">
+          <w:hyperlink w:anchor="_Toc240290481" w:history="1">
             <w:r>
               <w:rPr>
                 <w:rStyle w:val="Hipervnculo"/>
@@ -1554,7 +1662,7 @@
                 <w:noProof/>
                 <w:webHidden/>
               </w:rPr>
-              <w:instrText xml:space="preserve"> PAGEREF _Toc240061697 \h </w:instrText>
+              <w:instrText xml:space="preserve"> PAGEREF _Toc240290481 \h </w:instrText>
             </w:r>
             <w:r>
               <w:rPr>
@@ -1574,7 +1682,7 @@
                 <w:noProof/>
                 <w:webHidden/>
               </w:rPr>
-              <w:t>3</w:t>
+              <w:t>5</w:t>
             </w:r>
             <w:r>
               <w:rPr>
@@ -1601,7 +1709,7 @@
               <w14:ligatures w14:val="standardContextual"/>
             </w:rPr>
           </w:pPr>
-          <w:hyperlink w:anchor="_Toc240061698" w:history="1">
+          <w:hyperlink w:anchor="_Toc240290482" w:history="1">
             <w:r>
               <w:rPr>
                 <w:rStyle w:val="Hipervnculo"/>
@@ -1628,7 +1736,7 @@
                 <w:noProof/>
                 <w:webHidden/>
               </w:rPr>
-              <w:instrText xml:space="preserve"> PAGEREF _Toc240061698 \h </w:instrText>
+              <w:instrText xml:space="preserve"> PAGEREF _Toc240290482 \h </w:instrText>
             </w:r>
             <w:r>
               <w:rPr>
@@ -1648,7 +1756,7 @@
                 <w:noProof/>
                 <w:webHidden/>
               </w:rPr>
-              <w:t>3</w:t>
+              <w:t>5</w:t>
             </w:r>
             <w:r>
               <w:rPr>
@@ -1675,7 +1783,7 @@
               <w14:ligatures w14:val="standardContextual"/>
             </w:rPr>
           </w:pPr>
-          <w:hyperlink w:anchor="_Toc240061699" w:history="1">
+          <w:hyperlink w:anchor="_Toc240290483" w:history="1">
             <w:r>
               <w:rPr>
                 <w:rStyle w:val="Hipervnculo"/>
@@ -1702,7 +1810,7 @@
                 <w:noProof/>
                 <w:webHidden/>
               </w:rPr>
-              <w:instrText xml:space="preserve"> PAGEREF _Toc240061699 \h </w:instrText>
+              <w:instrText xml:space="preserve"> PAGEREF _Toc240290483 \h </w:instrText>
             </w:r>
             <w:r>
               <w:rPr>
@@ -1722,7 +1830,7 @@
                 <w:noProof/>
                 <w:webHidden/>
               </w:rPr>
-              <w:t>3</w:t>
+              <w:t>5</w:t>
             </w:r>
             <w:r>
               <w:rPr>
@@ -1749,7 +1857,7 @@
               <w14:ligatures w14:val="standardContextual"/>
             </w:rPr>
           </w:pPr>
-          <w:hyperlink w:anchor="_Toc240061700" w:history="1">
+          <w:hyperlink w:anchor="_Toc240290484" w:history="1">
             <w:r>
               <w:rPr>
                 <w:rStyle w:val="Hipervnculo"/>
@@ -1776,7 +1884,7 @@
                 <w:noProof/>
                 <w:webHidden/>
               </w:rPr>
-              <w:instrText xml:space="preserve"> PAGEREF _Toc240061700 \h </w:instrText>
+              <w:instrText xml:space="preserve"> PAGEREF _Toc240290484 \h </w:instrText>
             </w:r>
             <w:r>
               <w:rPr>
@@ -1796,7 +1904,7 @@
                 <w:noProof/>
                 <w:webHidden/>
               </w:rPr>
-              <w:t>3</w:t>
+              <w:t>5</w:t>
             </w:r>
             <w:r>
               <w:rPr>
@@ -1823,7 +1931,7 @@
               <w14:ligatures w14:val="standardContextual"/>
             </w:rPr>
           </w:pPr>
-          <w:hyperlink w:anchor="_Toc240061701" w:history="1">
+          <w:hyperlink w:anchor="_Toc240290485" w:history="1">
             <w:r>
               <w:rPr>
                 <w:rStyle w:val="Hipervnculo"/>
@@ -1850,7 +1958,7 @@
                 <w:noProof/>
                 <w:webHidden/>
               </w:rPr>
-              <w:instrText xml:space="preserve"> PAGEREF _Toc240061701 \h </w:instrText>
+              <w:instrText xml:space="preserve"> PAGEREF _Toc240290485 \h </w:instrText>
             </w:r>
             <w:r>
               <w:rPr>
@@ -1870,7 +1978,7 @@
                 <w:noProof/>
                 <w:webHidden/>
               </w:rPr>
-              <w:t>4</w:t>
+              <w:t>6</w:t>
             </w:r>
             <w:r>
               <w:rPr>
@@ -1897,7 +2005,7 @@
               <w14:ligatures w14:val="standardContextual"/>
             </w:rPr>
           </w:pPr>
-          <w:hyperlink w:anchor="_Toc240061702" w:history="1">
+          <w:hyperlink w:anchor="_Toc240290486" w:history="1">
             <w:r>
               <w:rPr>
                 <w:rStyle w:val="Hipervnculo"/>
@@ -1924,7 +2032,7 @@
                 <w:noProof/>
                 <w:webHidden/>
               </w:rPr>
-              <w:instrText xml:space="preserve"> PAGEREF _Toc240061702 \h </w:instrText>
+              <w:instrText xml:space="preserve"> PAGEREF _Toc240290486 \h </w:instrText>
             </w:r>
             <w:r>
               <w:rPr>
@@ -1944,7 +2052,7 @@
                 <w:noProof/>
                 <w:webHidden/>
               </w:rPr>
-              <w:t>4</w:t>
+              <w:t>6</w:t>
             </w:r>
             <w:r>
               <w:rPr>
@@ -1971,7 +2079,7 @@
               <w14:ligatures w14:val="standardContextual"/>
             </w:rPr>
           </w:pPr>
-          <w:hyperlink w:anchor="_Toc240061703" w:history="1">
+          <w:hyperlink w:anchor="_Toc240290487" w:history="1">
             <w:r>
               <w:rPr>
                 <w:rStyle w:val="Hipervnculo"/>
@@ -1998,7 +2106,7 @@
                 <w:noProof/>
                 <w:webHidden/>
               </w:rPr>
-              <w:instrText xml:space="preserve"> PAGEREF _Toc240061703 \h </w:instrText>
+              <w:instrText xml:space="preserve"> PAGEREF _Toc240290487 \h </w:instrText>
             </w:r>
             <w:r>
               <w:rPr>
@@ -2018,7 +2126,7 @@
                 <w:noProof/>
                 <w:webHidden/>
               </w:rPr>
-              <w:t>5</w:t>
+              <w:t>7</w:t>
             </w:r>
             <w:r>
               <w:rPr>
@@ -2045,7 +2153,7 @@
               <w14:ligatures w14:val="standardContextual"/>
             </w:rPr>
           </w:pPr>
-          <w:hyperlink w:anchor="_Toc240061704" w:history="1">
+          <w:hyperlink w:anchor="_Toc240290488" w:history="1">
             <w:r>
               <w:rPr>
                 <w:rStyle w:val="Hipervnculo"/>
@@ -2072,7 +2180,7 @@
                 <w:noProof/>
                 <w:webHidden/>
               </w:rPr>
-              <w:instrText xml:space="preserve"> PAGEREF _Toc240061704 \h </w:instrText>
+              <w:instrText xml:space="preserve"> PAGEREF _Toc240290488 \h </w:instrText>
             </w:r>
             <w:r>
               <w:rPr>
@@ -2092,7 +2200,7 @@
                 <w:noProof/>
                 <w:webHidden/>
               </w:rPr>
-              <w:t>5</w:t>
+              <w:t>7</w:t>
             </w:r>
             <w:r>
               <w:rPr>
@@ -2119,7 +2227,7 @@
               <w14:ligatures w14:val="standardContextual"/>
             </w:rPr>
           </w:pPr>
-          <w:hyperlink w:anchor="_Toc240061705" w:history="1">
+          <w:hyperlink w:anchor="_Toc240290489" w:history="1">
             <w:r>
               <w:rPr>
                 <w:rStyle w:val="Hipervnculo"/>
@@ -2146,7 +2254,7 @@
                 <w:noProof/>
                 <w:webHidden/>
               </w:rPr>
-              <w:instrText xml:space="preserve"> PAGEREF _Toc240061705 \h </w:instrText>
+              <w:instrText xml:space="preserve"> PAGEREF _Toc240290489 \h </w:instrText>
             </w:r>
             <w:r>
               <w:rPr>
@@ -2166,7 +2274,7 @@
                 <w:noProof/>
                 <w:webHidden/>
               </w:rPr>
-              <w:t>5</w:t>
+              <w:t>7</w:t>
             </w:r>
             <w:r>
               <w:rPr>
@@ -2193,7 +2301,7 @@
               <w14:ligatures w14:val="standardContextual"/>
             </w:rPr>
           </w:pPr>
-          <w:hyperlink w:anchor="_Toc240061706" w:history="1">
+          <w:hyperlink w:anchor="_Toc240290490" w:history="1">
             <w:r>
               <w:rPr>
                 <w:rStyle w:val="Hipervnculo"/>
@@ -2220,7 +2328,7 @@
                 <w:noProof/>
                 <w:webHidden/>
               </w:rPr>
-              <w:instrText xml:space="preserve"> PAGEREF _Toc240061706 \h </w:instrText>
+              <w:instrText xml:space="preserve"> PAGEREF _Toc240290490 \h </w:instrText>
             </w:r>
             <w:r>
               <w:rPr>
@@ -2240,7 +2348,7 @@
                 <w:noProof/>
                 <w:webHidden/>
               </w:rPr>
-              <w:t>6</w:t>
+              <w:t>8</w:t>
             </w:r>
             <w:r>
               <w:rPr>
@@ -2267,7 +2375,7 @@
               <w14:ligatures w14:val="standardContextual"/>
             </w:rPr>
           </w:pPr>
-          <w:hyperlink w:anchor="_Toc240061707" w:history="1">
+          <w:hyperlink w:anchor="_Toc240290491" w:history="1">
             <w:r>
               <w:rPr>
                 <w:rStyle w:val="Hipervnculo"/>
@@ -2295,7 +2403,7 @@
                 <w:noProof/>
                 <w:webHidden/>
               </w:rPr>
-              <w:instrText xml:space="preserve"> PAGEREF _Toc240061707 \h </w:instrText>
+              <w:instrText xml:space="preserve"> PAGEREF _Toc240290491 \h </w:instrText>
             </w:r>
             <w:r>
               <w:rPr>
@@ -2315,7 +2423,7 @@
                 <w:noProof/>
                 <w:webHidden/>
               </w:rPr>
-              <w:t>7</w:t>
+              <w:t>9</w:t>
             </w:r>
             <w:r>
               <w:rPr>
@@ -2342,7 +2450,7 @@
               <w14:ligatures w14:val="standardContextual"/>
             </w:rPr>
           </w:pPr>
-          <w:hyperlink w:anchor="_Toc240061708" w:history="1">
+          <w:hyperlink w:anchor="_Toc240290492" w:history="1">
             <w:r>
               <w:rPr>
                 <w:rStyle w:val="Hipervnculo"/>
@@ -2369,7 +2477,7 @@
                 <w:noProof/>
                 <w:webHidden/>
               </w:rPr>
-              <w:instrText xml:space="preserve"> PAGEREF _Toc240061708 \h </w:instrText>
+              <w:instrText xml:space="preserve"> PAGEREF _Toc240290492 \h </w:instrText>
             </w:r>
             <w:r>
               <w:rPr>
@@ -2389,7 +2497,7 @@
                 <w:noProof/>
                 <w:webHidden/>
               </w:rPr>
-              <w:t>10</w:t>
+              <w:t>12</w:t>
             </w:r>
             <w:r>
               <w:rPr>
@@ -2416,7 +2524,7 @@
               <w14:ligatures w14:val="standardContextual"/>
             </w:rPr>
           </w:pPr>
-          <w:hyperlink w:anchor="_Toc240061709" w:history="1">
+          <w:hyperlink w:anchor="_Toc240290493" w:history="1">
             <w:r>
               <w:rPr>
                 <w:rStyle w:val="Hipervnculo"/>
@@ -2443,7 +2551,7 @@
                 <w:noProof/>
                 <w:webHidden/>
               </w:rPr>
-              <w:instrText xml:space="preserve"> PAGEREF _Toc240061709 \h </w:instrText>
+              <w:instrText xml:space="preserve"> PAGEREF _Toc240290493 \h </w:instrText>
             </w:r>
             <w:r>
               <w:rPr>
@@ -2463,7 +2571,7 @@
                 <w:noProof/>
                 <w:webHidden/>
               </w:rPr>
-              <w:t>12</w:t>
+              <w:t>14</w:t>
             </w:r>
             <w:r>
               <w:rPr>
@@ -2490,7 +2598,7 @@
               <w14:ligatures w14:val="standardContextual"/>
             </w:rPr>
           </w:pPr>
-          <w:hyperlink w:anchor="_Toc240061710" w:history="1">
+          <w:hyperlink w:anchor="_Toc240290494" w:history="1">
             <w:r>
               <w:rPr>
                 <w:rStyle w:val="Hipervnculo"/>
@@ -2517,7 +2625,7 @@
                 <w:noProof/>
                 <w:webHidden/>
               </w:rPr>
-              <w:instrText xml:space="preserve"> PAGEREF _Toc240061710 \h </w:instrText>
+              <w:instrText xml:space="preserve"> PAGEREF _Toc240290494 \h </w:instrText>
             </w:r>
             <w:r>
               <w:rPr>
@@ -2537,7 +2645,7 @@
                 <w:noProof/>
                 <w:webHidden/>
               </w:rPr>
-              <w:t>13</w:t>
+              <w:t>15</w:t>
             </w:r>
             <w:r>
               <w:rPr>
@@ -2564,7 +2672,7 @@
               <w14:ligatures w14:val="standardContextual"/>
             </w:rPr>
           </w:pPr>
-          <w:hyperlink w:anchor="_Toc240061711" w:history="1">
+          <w:hyperlink w:anchor="_Toc240290495" w:history="1">
             <w:r>
               <w:rPr>
                 <w:rStyle w:val="Hipervnculo"/>
@@ -2591,7 +2699,7 @@
                 <w:noProof/>
                 <w:webHidden/>
               </w:rPr>
-              <w:instrText xml:space="preserve"> PAGEREF _Toc240061711 \h </w:instrText>
+              <w:instrText xml:space="preserve"> PAGEREF _Toc240290495 \h </w:instrText>
             </w:r>
             <w:r>
               <w:rPr>
@@ -2611,7 +2719,7 @@
                 <w:noProof/>
                 <w:webHidden/>
               </w:rPr>
-              <w:t>13</w:t>
+              <w:t>15</w:t>
             </w:r>
             <w:r>
               <w:rPr>
@@ -2640,18 +2748,6 @@
     </w:sdt>
     <w:p>
       <w:pPr>
-        <w:pStyle w:val="Default"/>
-        <w:spacing w:line="276" w:lineRule="auto"/>
-        <w:rPr>
-          <w:rFonts w:ascii="Arial" w:hAnsi="Arial" w:cs="Arial"/>
-          <w:b/>
-          <w:bCs/>
-          <w:u w:val="single"/>
-        </w:rPr>
-      </w:pPr>
-    </w:p>
-    <w:p>
-      <w:pPr>
         <w:spacing w:line="276" w:lineRule="auto"/>
         <w:rPr>
           <w:rFonts w:eastAsiaTheme="minorHAnsi" w:cs="Arial"/>
@@ -2672,12 +2768,12 @@
       <w:pPr>
         <w:pStyle w:val="Ttulo1"/>
       </w:pPr>
-      <w:bookmarkStart w:id="1" w:name="_Toc240061693"/>
+      <w:bookmarkStart w:id="2" w:name="_Toc240290477"/>
       <w:r>
         <w:lastRenderedPageBreak/>
         <w:t>Introducción</w:t>
       </w:r>
-      <w:bookmarkEnd w:id="1"/>
+      <w:bookmarkEnd w:id="2"/>
     </w:p>
     <w:p>
       <w:pPr>
@@ -3021,21 +3117,21 @@
       <w:pPr>
         <w:pStyle w:val="Ttulo1"/>
       </w:pPr>
-      <w:bookmarkStart w:id="2" w:name="_Toc240061694"/>
+      <w:bookmarkStart w:id="3" w:name="_Toc240290478"/>
       <w:r>
         <w:t>Objetivo</w:t>
       </w:r>
-      <w:bookmarkEnd w:id="2"/>
+      <w:bookmarkEnd w:id="3"/>
     </w:p>
     <w:p>
       <w:pPr>
         <w:pStyle w:val="Ttulo2"/>
       </w:pPr>
-      <w:bookmarkStart w:id="3" w:name="_Toc240061695"/>
+      <w:bookmarkStart w:id="4" w:name="_Toc240290479"/>
       <w:r>
         <w:t>Objetivo general</w:t>
       </w:r>
-      <w:bookmarkEnd w:id="3"/>
+      <w:bookmarkEnd w:id="4"/>
     </w:p>
     <w:p>
       <w:r>
@@ -3059,11 +3155,11 @@
       <w:pPr>
         <w:pStyle w:val="Ttulo2"/>
       </w:pPr>
-      <w:bookmarkStart w:id="4" w:name="_Toc240061696"/>
+      <w:bookmarkStart w:id="5" w:name="_Toc240290480"/>
       <w:r>
         <w:t>Público objetivo</w:t>
       </w:r>
-      <w:bookmarkEnd w:id="4"/>
+      <w:bookmarkEnd w:id="5"/>
     </w:p>
     <w:p>
       <w:pPr>
@@ -3142,7 +3238,7 @@
       <w:pPr>
         <w:pStyle w:val="Ttulo2"/>
       </w:pPr>
-      <w:bookmarkStart w:id="5" w:name="_Toc240061697"/>
+      <w:bookmarkStart w:id="6" w:name="_Toc240290481"/>
       <w:r>
         <w:lastRenderedPageBreak/>
         <w:t>Objetivo</w:t>
@@ -3156,7 +3252,7 @@
       <w:r>
         <w:t>s</w:t>
       </w:r>
-      <w:bookmarkEnd w:id="5"/>
+      <w:bookmarkEnd w:id="6"/>
     </w:p>
     <w:p>
       <w:r>
@@ -3352,21 +3448,21 @@
       <w:pPr>
         <w:pStyle w:val="Ttulo1"/>
       </w:pPr>
-      <w:bookmarkStart w:id="6" w:name="_Toc240061698"/>
+      <w:bookmarkStart w:id="7" w:name="_Toc240290482"/>
       <w:r>
         <w:t>Descripción del Proyecto</w:t>
       </w:r>
-      <w:bookmarkEnd w:id="6"/>
+      <w:bookmarkEnd w:id="7"/>
     </w:p>
     <w:p>
       <w:pPr>
         <w:pStyle w:val="Ttulo2"/>
       </w:pPr>
-      <w:bookmarkStart w:id="7" w:name="_Toc240061699"/>
+      <w:bookmarkStart w:id="8" w:name="_Toc240290483"/>
       <w:r>
         <w:t>Definición</w:t>
       </w:r>
-      <w:bookmarkEnd w:id="7"/>
+      <w:bookmarkEnd w:id="8"/>
     </w:p>
     <w:p>
       <w:pPr>
@@ -3660,11 +3756,11 @@
       <w:pPr>
         <w:pStyle w:val="Ttulo2"/>
       </w:pPr>
-      <w:bookmarkStart w:id="8" w:name="_Toc240061700"/>
+      <w:bookmarkStart w:id="9" w:name="_Toc240290484"/>
       <w:r>
         <w:t>Surgimiento</w:t>
       </w:r>
-      <w:bookmarkEnd w:id="8"/>
+      <w:bookmarkEnd w:id="9"/>
     </w:p>
     <w:p>
       <w:r>
@@ -3714,11 +3810,11 @@
       <w:pPr>
         <w:pStyle w:val="Ttulo2"/>
       </w:pPr>
-      <w:bookmarkStart w:id="9" w:name="_Toc240061701"/>
+      <w:bookmarkStart w:id="10" w:name="_Toc240290485"/>
       <w:r>
         <w:t>Problemática a tratar</w:t>
       </w:r>
-      <w:bookmarkEnd w:id="9"/>
+      <w:bookmarkEnd w:id="10"/>
     </w:p>
     <w:p>
       <w:r>
@@ -3798,11 +3894,11 @@
       <w:pPr>
         <w:pStyle w:val="Ttulo2"/>
       </w:pPr>
-      <w:bookmarkStart w:id="10" w:name="_Toc240061702"/>
+      <w:bookmarkStart w:id="11" w:name="_Toc240290486"/>
       <w:r>
         <w:t>Definición del alcance</w:t>
       </w:r>
-      <w:bookmarkEnd w:id="10"/>
+      <w:bookmarkEnd w:id="11"/>
     </w:p>
     <w:p>
       <w:pPr>
@@ -3948,22 +4044,22 @@
       <w:pPr>
         <w:pStyle w:val="Ttulo1"/>
       </w:pPr>
-      <w:bookmarkStart w:id="11" w:name="_Toc240061703"/>
+      <w:bookmarkStart w:id="12" w:name="_Toc240290487"/>
       <w:r>
         <w:lastRenderedPageBreak/>
         <w:t>Desarrollo</w:t>
       </w:r>
-      <w:bookmarkEnd w:id="11"/>
+      <w:bookmarkEnd w:id="12"/>
     </w:p>
     <w:p>
       <w:pPr>
         <w:pStyle w:val="Ttulo2"/>
       </w:pPr>
-      <w:bookmarkStart w:id="12" w:name="_Toc240061704"/>
+      <w:bookmarkStart w:id="13" w:name="_Toc240290488"/>
       <w:r>
         <w:t>Investigación inicial</w:t>
       </w:r>
-      <w:bookmarkEnd w:id="12"/>
+      <w:bookmarkEnd w:id="13"/>
     </w:p>
     <w:p>
       <w:r>
@@ -4007,11 +4103,11 @@
       <w:pPr>
         <w:pStyle w:val="Ttulo2"/>
       </w:pPr>
-      <w:bookmarkStart w:id="13" w:name="_Toc240061705"/>
+      <w:bookmarkStart w:id="14" w:name="_Toc240290489"/>
       <w:r>
         <w:t>Preparación del corpus</w:t>
       </w:r>
-      <w:bookmarkEnd w:id="13"/>
+      <w:bookmarkEnd w:id="14"/>
     </w:p>
     <w:p>
       <w:r>
@@ -4206,12 +4302,12 @@
       <w:pPr>
         <w:pStyle w:val="Ttulo2"/>
       </w:pPr>
-      <w:bookmarkStart w:id="14" w:name="_Toc240061706"/>
+      <w:bookmarkStart w:id="15" w:name="_Toc240290490"/>
       <w:r>
         <w:lastRenderedPageBreak/>
         <w:t>Funcionamiento</w:t>
       </w:r>
-      <w:bookmarkEnd w:id="14"/>
+      <w:bookmarkEnd w:id="15"/>
     </w:p>
     <w:p>
       <w:pPr>
@@ -4793,14 +4889,14 @@
           <w:lang w:val="es-AR"/>
         </w:rPr>
       </w:pPr>
-      <w:bookmarkStart w:id="15" w:name="_Toc240061707"/>
+      <w:bookmarkStart w:id="16" w:name="_Toc240290491"/>
       <w:r>
         <w:rPr>
           <w:lang w:val="es-AR"/>
         </w:rPr>
         <w:t>Abstención</w:t>
       </w:r>
-      <w:bookmarkEnd w:id="15"/>
+      <w:bookmarkEnd w:id="16"/>
     </w:p>
     <w:p>
       <w:pPr>
@@ -4884,6 +4980,7 @@
       </w:pPr>
       <w:r>
         <w:rPr>
+          <w:noProof/>
           <w:lang w:val="es-AR"/>
         </w:rPr>
         <w:drawing>
@@ -5225,6 +5322,7 @@
       </w:pPr>
       <w:r>
         <w:rPr>
+          <w:noProof/>
           <w:lang w:val="es-AR"/>
         </w:rPr>
         <w:drawing>
@@ -5593,12 +5691,12 @@
       <w:pPr>
         <w:pStyle w:val="Ttulo2"/>
       </w:pPr>
-      <w:bookmarkStart w:id="16" w:name="_Toc240061708"/>
+      <w:bookmarkStart w:id="17" w:name="_Toc240290492"/>
       <w:r>
         <w:lastRenderedPageBreak/>
         <w:t>Evolución del proyecto</w:t>
       </w:r>
-      <w:bookmarkEnd w:id="16"/>
+      <w:bookmarkEnd w:id="17"/>
     </w:p>
     <w:p>
       <w:pPr>
@@ -5977,7 +6075,7 @@
       <w:pPr>
         <w:pStyle w:val="Ttulo2"/>
       </w:pPr>
-      <w:bookmarkStart w:id="17" w:name="_Toc240061709"/>
+      <w:bookmarkStart w:id="18" w:name="_Toc240290493"/>
       <w:r>
         <w:lastRenderedPageBreak/>
         <w:t>Problemáticas</w:t>
@@ -5985,7 +6083,7 @@
       <w:r>
         <w:t xml:space="preserve"> / Soluciones</w:t>
       </w:r>
-      <w:bookmarkEnd w:id="17"/>
+      <w:bookmarkEnd w:id="18"/>
     </w:p>
     <w:p>
       <w:pPr>
@@ -6727,12 +6825,12 @@
       <w:pPr>
         <w:pStyle w:val="Ttulo1"/>
       </w:pPr>
-      <w:bookmarkStart w:id="18" w:name="_Toc240061710"/>
+      <w:bookmarkStart w:id="19" w:name="_Toc240290494"/>
       <w:r>
         <w:lastRenderedPageBreak/>
         <w:t>Resultados</w:t>
       </w:r>
-      <w:bookmarkEnd w:id="18"/>
+      <w:bookmarkEnd w:id="19"/>
     </w:p>
     <w:p>
       <w:r>
@@ -6843,10 +6941,7 @@
               <w:t>2.505 documentos,</w:t>
             </w:r>
             <w:r>
-              <w:t xml:space="preserve"> </w:t>
-            </w:r>
-            <w:r>
-              <w:t>146.645 fragmentos</w:t>
+              <w:t xml:space="preserve"> 146.645 fragmentos</w:t>
             </w:r>
             <w:r>
               <w:t xml:space="preserve">, </w:t>
@@ -7250,14 +7345,14 @@
       <w:pPr>
         <w:pStyle w:val="Ttulo1"/>
       </w:pPr>
-      <w:bookmarkStart w:id="19" w:name="_Toc240061711"/>
+      <w:bookmarkStart w:id="20" w:name="_Toc240290495"/>
       <w:r>
         <w:t>Conclusi</w:t>
       </w:r>
       <w:r>
         <w:t>ones</w:t>
       </w:r>
-      <w:bookmarkEnd w:id="19"/>
+      <w:bookmarkEnd w:id="20"/>
     </w:p>
     <w:p>
       <w:r>
@@ -7920,7 +8015,7 @@
                               <w:i/>
                               <w:sz w:val="20"/>
                             </w:rPr>
-                            <w:t>4</w:t>
+                            <w:t>6</w:t>
                           </w:r>
                         </w:p>
                       </w:txbxContent>
@@ -8005,7 +8100,7 @@
                         <w:i/>
                         <w:sz w:val="20"/>
                       </w:rPr>
-                      <w:t>4</w:t>
+                      <w:t>6</w:t>
                     </w:r>
                   </w:p>
                 </w:txbxContent>
@@ -8119,10 +8214,7 @@
         <w:footnoteRef/>
       </w:r>
       <w:r>
-        <w:t xml:space="preserve"> </w:t>
-      </w:r>
-      <w:r>
-        <w:t>Documentación/</w:t>
+        <w:t xml:space="preserve"> Documentación/</w:t>
       </w:r>
       <w:r>
         <w:t>Diagrama_de_Gantt</w:t>
@@ -10266,6 +10358,7 @@
   <w:style w:type="character" w:default="1" w:styleId="Fuentedeprrafopredeter">
     <w:name w:val="Default Paragraph Font"/>
     <w:uiPriority w:val="1"/>
+    <w:semiHidden/>
     <w:unhideWhenUsed/>
   </w:style>
   <w:style w:type="table" w:default="1" w:styleId="Tablanormal">

</xml_diff>